<commit_message>
Add pipeline flow chart to final report
</commit_message>
<xml_diff>
--- a/reports/INDENG-290-Final-Report-30-page-draft.docx
+++ b/reports/INDENG-290-Final-Report-30-page-draft.docx
@@ -227,6 +227,74 @@
       </w:pPr>
       <w:r>
         <w:t>Data Processing and Unit Standardization</w:t>
+      </w:r>
+    </w:p>
+    <w:p>
+      <w:pPr>
+        <w:pStyle w:val="Heading2"/>
+      </w:pPr>
+      <w:r>
+        <w:t>Pipeline Flow Chart</w:t>
+      </w:r>
+    </w:p>
+    <w:p>
+      <w:pPr>
+        <w:spacing w:after="120"/>
+      </w:pPr>
+      <w:r>
+        <w:t>Figure 1 summarizes the reproducible workflow used in the GitHub repository: raw forecast and market data are standardized into real 2025 dollars, matched into a 3-year and 5-year evaluation panel, and then passed into benchmark, model-extension, and diagnostic analyses before final tables and figures are exported.</w:t>
+      </w:r>
+    </w:p>
+    <w:p>
+      <w:pPr>
+        <w:jc w:val="center"/>
+      </w:pPr>
+      <w:r>
+        <w:drawing>
+          <wp:inline xmlns:a="http://schemas.openxmlformats.org/drawingml/2006/main" xmlns:pic="http://schemas.openxmlformats.org/drawingml/2006/picture">
+            <wp:extent cx="5760720" cy="3180418"/>
+            <wp:docPr id="5" name="Picture 5"/>
+            <wp:cNvGraphicFramePr>
+              <a:graphicFrameLocks noChangeAspect="1"/>
+            </wp:cNvGraphicFramePr>
+            <a:graphic>
+              <a:graphicData uri="http://schemas.openxmlformats.org/drawingml/2006/picture">
+                <pic:pic>
+                  <pic:nvPicPr>
+                    <pic:cNvPr id="0" name="report_pipeline_flowchart.png"/>
+                    <pic:cNvPicPr/>
+                  </pic:nvPicPr>
+                  <pic:blipFill>
+                    <a:blip r:embed="rId14"/>
+                    <a:stretch>
+                      <a:fillRect/>
+                    </a:stretch>
+                  </pic:blipFill>
+                  <pic:spPr>
+                    <a:xfrm>
+                      <a:off x="0" y="0"/>
+                      <a:ext cx="5760720" cy="3180418"/>
+                    </a:xfrm>
+                    <a:prstGeom prst="rect"/>
+                  </pic:spPr>
+                </pic:pic>
+              </a:graphicData>
+            </a:graphic>
+          </wp:inline>
+        </w:drawing>
+      </w:r>
+    </w:p>
+    <w:p>
+      <w:pPr>
+        <w:spacing w:after="160"/>
+        <w:jc w:val="center"/>
+      </w:pPr>
+      <w:r>
+        <w:rPr>
+          <w:i/>
+          <w:sz w:val="18"/>
+        </w:rPr>
+        <w:t>Figure 1. Project pipeline flow chart from raw data through final outputs.</w:t>
       </w:r>
     </w:p>
     <w:p>

</xml_diff>